<commit_message>
fix(onboarding): register volunteer template markers
</commit_message>
<xml_diff>
--- a/apps/api/templates/1_Volunteer_Form.docx
+++ b/apps/api/templates/1_Volunteer_Form.docx
@@ -2879,6 +2879,39 @@
         <w:rPr>
           <w:rtl w:val="0"/>
         </w:rPr>
+      </w:r>
+    </w:p>
+    <w:p>
+      <w:pPr>
+        <w:spacing w:before="240"/>
+      </w:pPr>
+      <w:r>
+        <w:t xml:space="preserve">DIGITAL ONBOARDING RECORD</w:t>
+        <w:br/>
+      </w:r>
+      <w:r>
+        <w:t xml:space="preserve">Full name: {{full_name}}</w:t>
+        <w:br/>
+      </w:r>
+      <w:r>
+        <w:t xml:space="preserve">Date of birth: {{date_of_birth}}</w:t>
+        <w:br/>
+      </w:r>
+      <w:r>
+        <w:t xml:space="preserve">Volunteer role: {{volunteer_role}}</w:t>
+        <w:br/>
+      </w:r>
+      <w:r>
+        <w:t xml:space="preserve">Track: {{track}}</w:t>
+        <w:br/>
+      </w:r>
+      <w:r>
+        <w:t xml:space="preserve">Volunteer consent: {{consent}}</w:t>
+        <w:br/>
+      </w:r>
+      <w:r>
+        <w:t xml:space="preserve">Signature: [[signature_subject]]</w:t>
+        <w:br/>
       </w:r>
     </w:p>
     <w:sectPr>

</xml_diff>

<commit_message>
fix(templates): remove legacy placeholder block from the volunteer form
The trailing DIGITAL ONBOARDING RECORD paragraph belonged to the retired
fill_template flow and printed raw {{full_name}} / [[signature_subject]] text
into the signed PDF. Re-pins source_hash and asserts every manifest hash
matches its file, so an edited legal template cannot drift from its pin.
</commit_message>
<xml_diff>
--- a/apps/api/templates/1_Volunteer_Form.docx
+++ b/apps/api/templates/1_Volunteer_Form.docx
@@ -2879,39 +2879,6 @@
         <w:rPr>
           <w:rtl w:val="0"/>
         </w:rPr>
-      </w:r>
-    </w:p>
-    <w:p>
-      <w:pPr>
-        <w:spacing w:before="240"/>
-      </w:pPr>
-      <w:r>
-        <w:t xml:space="preserve">DIGITAL ONBOARDING RECORD</w:t>
-        <w:br/>
-      </w:r>
-      <w:r>
-        <w:t xml:space="preserve">Full name: {{full_name}}</w:t>
-        <w:br/>
-      </w:r>
-      <w:r>
-        <w:t xml:space="preserve">Date of birth: {{date_of_birth}}</w:t>
-        <w:br/>
-      </w:r>
-      <w:r>
-        <w:t xml:space="preserve">Volunteer role: {{volunteer_role}}</w:t>
-        <w:br/>
-      </w:r>
-      <w:r>
-        <w:t xml:space="preserve">Track: {{track}}</w:t>
-        <w:br/>
-      </w:r>
-      <w:r>
-        <w:t xml:space="preserve">Volunteer consent: {{consent}}</w:t>
-        <w:br/>
-      </w:r>
-      <w:r>
-        <w:t xml:space="preserve">Signature: [[signature_subject]]</w:t>
-        <w:br/>
       </w:r>
     </w:p>
     <w:sectPr>

</xml_diff>